<commit_message>
Update ENES222 lectures to expand example solution
</commit_message>
<xml_diff>
--- a/Signals/html_Lectures/notes/Lecture 01 Notes.docx
+++ b/Signals/html_Lectures/notes/Lecture 01 Notes.docx
@@ -252,53 +252,79 @@
           <w:sz w:val="22"/>
           <w:szCs w:val="22"/>
         </w:rPr>
-        <w:t xml:space="preserve">z is a point, equivalently an arrow from the origin. Name the symbols now: x and y are the horizontal/vertical coordinates, r is the distance from the origin, θ is the angle of the arrow measured from the positive horizontal axis.</w:t>
-      </w:r>
-    </w:p>
-    <w:p>
-      <w:pPr>
-        <w:pStyle w:val="ListParagraph"/>
-        <w:numPr>
-          <w:ilvl w:val="0"/>
-          <w:numId w:val="2"/>
-        </w:numPr>
-        <w:spacing w:after="80"/>
-      </w:pPr>
-      <w:r>
-        <w:rPr>
-          <w:rFonts w:ascii="Calibri" w:cs="Calibri" w:eastAsia="Calibri" w:hAnsi="Calibri"/>
-          <w:sz w:val="22"/>
-          <w:szCs w:val="22"/>
-        </w:rPr>
-        <w:t xml:space="preserve">Fig. 1 (the point z = (3, 2) with dashed projections) is the hand-drawn schematic; point at r, θ, x, y in turn. About 2 min.</w:t>
-      </w:r>
-    </w:p>
-    <w:p>
-      <w:pPr>
-        <w:pBdr>
-          <w:left w:val="single" w:color="7A1A1A" w:sz="18" w:space="8"/>
-        </w:pBdr>
-        <w:spacing w:after="140" w:before="100"/>
-        <w:ind w:left="360"/>
-      </w:pPr>
-      <w:r>
-        <w:rPr>
-          <w:rFonts w:ascii="Calibri" w:cs="Calibri" w:eastAsia="Calibri" w:hAnsi="Calibri"/>
-          <w:b/>
-          <w:bCs/>
-          <w:color w:val="7A1A1A"/>
-          <w:sz w:val="22"/>
-          <w:szCs w:val="22"/>
-        </w:rPr>
-        <w:t xml:space="preserve">Why it matters: </w:t>
-      </w:r>
-      <w:r>
-        <w:rPr>
-          <w:rFonts w:ascii="Calibri" w:cs="Calibri" w:eastAsia="Calibri" w:hAnsi="Calibri"/>
-          <w:sz w:val="22"/>
-          <w:szCs w:val="22"/>
-        </w:rPr>
-        <w:t xml:space="preserve">Both addresses name the same point; the whole lecture is converting between them.</w:t>
+        <w:t xml:space="preserve">Notation first. z is one complex number. x = horizontal coordinate, y = vertical coordinate, r = distance from the origin to the point, θ = angle of the arrow measured counter-clockwise from the positive horizontal axis.</w:t>
+      </w:r>
+    </w:p>
+    <w:p>
+      <w:pPr>
+        <w:pStyle w:val="ListParagraph"/>
+        <w:numPr>
+          <w:ilvl w:val="0"/>
+          <w:numId w:val="2"/>
+        </w:numPr>
+        <w:spacing w:after="80"/>
+      </w:pPr>
+      <w:r>
+        <w:rPr>
+          <w:rFonts w:ascii="Calibri" w:cs="Calibri" w:eastAsia="Calibri" w:hAnsi="Calibri"/>
+          <w:sz w:val="22"/>
+          <w:szCs w:val="22"/>
+        </w:rPr>
+        <w:t xml:space="preserve">The figure is a schematic with the letters z = (x, y), r, x, y, θ and no numbers. On the board use the example z = (3, 2): 3 to the right, 2 up; draw the arrow from 0 to z and label it r.</w:t>
+      </w:r>
+    </w:p>
+    <w:p>
+      <w:pPr>
+        <w:pStyle w:val="ListParagraph"/>
+        <w:numPr>
+          <w:ilvl w:val="0"/>
+          <w:numId w:val="2"/>
+        </w:numPr>
+        <w:spacing w:after="80"/>
+      </w:pPr>
+      <w:r>
+        <w:rPr>
+          <w:rFonts w:ascii="Calibri" w:cs="Calibri" w:eastAsia="Calibri" w:hAnsi="Calibri"/>
+          <w:sz w:val="22"/>
+          <w:szCs w:val="22"/>
+        </w:rPr>
+        <w:t xml:space="preserve">Drop the dashed vertical from z to the horizontal axis (length y = 2) and the dashed horizontal to the vertical axis (length x = 3). You now have a right triangle with legs 3 and 2.</w:t>
+      </w:r>
+    </w:p>
+    <w:p>
+      <w:pPr>
+        <w:pStyle w:val="ListParagraph"/>
+        <w:numPr>
+          <w:ilvl w:val="0"/>
+          <w:numId w:val="2"/>
+        </w:numPr>
+        <w:spacing w:after="80"/>
+      </w:pPr>
+      <w:r>
+        <w:rPr>
+          <w:rFonts w:ascii="Calibri" w:cs="Calibri" w:eastAsia="Calibri" w:hAnsi="Calibri"/>
+          <w:sz w:val="22"/>
+          <w:szCs w:val="22"/>
+        </w:rPr>
+        <w:t xml:space="preserve">Mark the angle θ between the horizontal axis and the arrow. Say it: the SAME point has two addresses, (x, y) = (3, 2) and (r, θ) = (3.606, 0.588 rad). The rest of the lecture is moving between them.</w:t>
+      </w:r>
+    </w:p>
+    <w:p>
+      <w:pPr>
+        <w:pStyle w:val="ListParagraph"/>
+        <w:numPr>
+          <w:ilvl w:val="0"/>
+          <w:numId w:val="2"/>
+        </w:numPr>
+        <w:spacing w:after="80"/>
+      </w:pPr>
+      <w:r>
+        <w:rPr>
+          <w:rFonts w:ascii="Calibri" w:cs="Calibri" w:eastAsia="Calibri" w:hAnsi="Calibri"/>
+          <w:sz w:val="22"/>
+          <w:szCs w:val="22"/>
+        </w:rPr>
+        <w:t xml:space="preserve">Check the second address now so nobody has to trust it: r = √(3² + 2²) = √13 = 3.606; θ = arctan(2/3) = 0.588 rad = 33.7°. About 2 min.</w:t>
       </w:r>
     </w:p>
     <w:p>
@@ -346,25 +372,61 @@
           <w:sz w:val="22"/>
           <w:szCs w:val="22"/>
         </w:rPr>
-        <w:t xml:space="preserve">x = Re{z}, y = Im{z}; write z = x + jy where j = √−1 is the imaginary unit (engineers use j because i means current).</w:t>
-      </w:r>
-    </w:p>
-    <w:p>
-      <w:pPr>
-        <w:pStyle w:val="ListParagraph"/>
-        <w:numPr>
-          <w:ilvl w:val="0"/>
-          <w:numId w:val="2"/>
-        </w:numPr>
-        <w:spacing w:after="80"/>
-      </w:pPr>
-      <w:r>
-        <w:rPr>
-          <w:rFonts w:ascii="Calibri" w:cs="Calibri" w:eastAsia="Calibri" w:hAnsi="Calibri"/>
-          <w:sz w:val="22"/>
-          <w:szCs w:val="22"/>
-        </w:rPr>
-        <w:t xml:space="preserve">"Re{z} = −5" means five units left of the origin; the imaginary axis tells how far up or down.</w:t>
+        <w:t xml:space="preserve">Write z = x + jy. j = √−1, so j² = −1. (j, not i, because i is current in this course.)</w:t>
+      </w:r>
+    </w:p>
+    <w:p>
+      <w:pPr>
+        <w:pStyle w:val="ListParagraph"/>
+        <w:numPr>
+          <w:ilvl w:val="0"/>
+          <w:numId w:val="2"/>
+        </w:numPr>
+        <w:spacing w:after="80"/>
+      </w:pPr>
+      <w:r>
+        <w:rPr>
+          <w:rFonts w:ascii="Calibri" w:cs="Calibri" w:eastAsia="Calibri" w:hAnsi="Calibri"/>
+          <w:sz w:val="22"/>
+          <w:szCs w:val="22"/>
+        </w:rPr>
+        <w:t xml:space="preserve">Notation: Re{z} means 'take the real part', Im{z} means 'take the imaginary part'. Example: z = −5 + 2j gives Re{z} = −5 and Im{z} = 2. The j is NOT part of Im{z}: Im{z} = 2, not 2j.</w:t>
+      </w:r>
+    </w:p>
+    <w:p>
+      <w:pPr>
+        <w:pStyle w:val="ListParagraph"/>
+        <w:numPr>
+          <w:ilvl w:val="0"/>
+          <w:numId w:val="2"/>
+        </w:numPr>
+        <w:spacing w:after="80"/>
+      </w:pPr>
+      <w:r>
+        <w:rPr>
+          <w:rFonts w:ascii="Calibri" w:cs="Calibri" w:eastAsia="Calibri" w:hAnsi="Calibri"/>
+          <w:sz w:val="22"/>
+          <w:szCs w:val="22"/>
+        </w:rPr>
+        <w:t xml:space="preserve">Read it as a map: Re{z} = −5 means go 5 units LEFT of the origin; Im{z} = 2 means go 2 units UP. Mark that point on the figure.</w:t>
+      </w:r>
+    </w:p>
+    <w:p>
+      <w:pPr>
+        <w:pStyle w:val="ListParagraph"/>
+        <w:numPr>
+          <w:ilvl w:val="0"/>
+          <w:numId w:val="2"/>
+        </w:numPr>
+        <w:spacing w:after="80"/>
+      </w:pPr>
+      <w:r>
+        <w:rPr>
+          <w:rFonts w:ascii="Calibri" w:cs="Calibri" w:eastAsia="Calibri" w:hAnsi="Calibri"/>
+          <w:sz w:val="22"/>
+          <w:szCs w:val="22"/>
+        </w:rPr>
+        <w:t xml:space="preserve">Axes: horizontal = real axis (Re), vertical = imaginary axis (Im). A purely real number such as 4 sits on the horizontal axis; a purely imaginary number such as 3j sits on the vertical axis.</w:t>
       </w:r>
     </w:p>
     <w:p>
@@ -412,25 +474,43 @@
           <w:sz w:val="22"/>
           <w:szCs w:val="22"/>
         </w:rPr>
-        <w:t xml:space="preserve">r = |z| is the distance (never negative); θ = ∠z is measured counter-clockwise from the positive real axis, in radians.</w:t>
-      </w:r>
-    </w:p>
-    <w:p>
-      <w:pPr>
-        <w:pStyle w:val="ListParagraph"/>
-        <w:numPr>
-          <w:ilvl w:val="0"/>
-          <w:numId w:val="2"/>
-        </w:numPr>
-        <w:spacing w:after="80"/>
-      </w:pPr>
-      <w:r>
-        <w:rPr>
-          <w:rFonts w:ascii="Calibri" w:cs="Calibri" w:eastAsia="Calibri" w:hAnsi="Calibri"/>
-          <w:sz w:val="22"/>
-          <w:szCs w:val="22"/>
-        </w:rPr>
-        <w:t xml:space="preserve">Why keep two systems: addition is easy in Cartesian; multiplication, rotation and the link to sinusoids are easy in polar.</w:t>
+        <w:t xml:space="preserve">Notation: |z| (read 'modulus of z') is the distance from the origin to z. ∠z (read 'angle of z') is the direction of the arrow, counter-clockwise from the positive real axis, in radians.</w:t>
+      </w:r>
+    </w:p>
+    <w:p>
+      <w:pPr>
+        <w:pStyle w:val="ListParagraph"/>
+        <w:numPr>
+          <w:ilvl w:val="0"/>
+          <w:numId w:val="2"/>
+        </w:numPr>
+        <w:spacing w:after="80"/>
+      </w:pPr>
+      <w:r>
+        <w:rPr>
+          <w:rFonts w:ascii="Calibri" w:cs="Calibri" w:eastAsia="Calibri" w:hAnsi="Calibri"/>
+          <w:sz w:val="22"/>
+          <w:szCs w:val="22"/>
+        </w:rPr>
+        <w:t xml:space="preserve">Notation: r = |z| ≥ 0 always (a distance cannot be negative); θ = ∠z can be any real number, but two angles that differ by 2π name the same direction.</w:t>
+      </w:r>
+    </w:p>
+    <w:p>
+      <w:pPr>
+        <w:pStyle w:val="ListParagraph"/>
+        <w:numPr>
+          <w:ilvl w:val="0"/>
+          <w:numId w:val="2"/>
+        </w:numPr>
+        <w:spacing w:after="80"/>
+      </w:pPr>
+      <w:r>
+        <w:rPr>
+          <w:rFonts w:ascii="Calibri" w:cs="Calibri" w:eastAsia="Calibri" w:hAnsi="Calibri"/>
+          <w:sz w:val="22"/>
+          <w:szCs w:val="22"/>
+        </w:rPr>
+        <w:t xml:space="preserve">Tiny numeric example: z = 3 + 4j has |z| = 5 and ∠z = 0.927 rad (53.1°). Why keep both addresses: addition is easy in (x, y); multiplication and rotation are easy in (r, θ).</w:t>
       </w:r>
     </w:p>
     <w:p>
@@ -478,25 +558,97 @@
           <w:sz w:val="22"/>
           <w:szCs w:val="22"/>
         </w:rPr>
-        <w:t xml:space="preserve">x = r cos θ, y = r sin θ: the right triangle with hypotenuse r, adjacent side x, opposite side y.</w:t>
-      </w:r>
-    </w:p>
-    <w:p>
-      <w:pPr>
-        <w:pStyle w:val="ListParagraph"/>
-        <w:numPr>
-          <w:ilvl w:val="0"/>
-          <w:numId w:val="2"/>
-        </w:numPr>
-        <w:spacing w:after="80"/>
-      </w:pPr>
-      <w:r>
-        <w:rPr>
-          <w:rFonts w:ascii="Calibri" w:cs="Calibri" w:eastAsia="Calibri" w:hAnsi="Calibri"/>
-          <w:sz w:val="22"/>
-          <w:szCs w:val="22"/>
-        </w:rPr>
-        <w:t xml:space="preserve">No sign correction needed here — cos and sin already carry the sign of each quadrant.</w:t>
+        <w:t xml:space="preserve">Given: polar address (r, θ). Wanted: (x, y). Draw the right triangle: hypotenuse r, angle θ at the origin, adjacent side x, opposite side y.</w:t>
+      </w:r>
+    </w:p>
+    <w:p>
+      <w:pPr>
+        <w:pStyle w:val="ListParagraph"/>
+        <w:numPr>
+          <w:ilvl w:val="0"/>
+          <w:numId w:val="2"/>
+        </w:numPr>
+        <w:spacing w:after="80"/>
+      </w:pPr>
+      <w:r>
+        <w:rPr>
+          <w:rFonts w:ascii="Calibri" w:cs="Calibri" w:eastAsia="Calibri" w:hAnsi="Calibri"/>
+          <w:sz w:val="22"/>
+          <w:szCs w:val="22"/>
+        </w:rPr>
+        <w:t xml:space="preserve">Step 1 — adjacent over hypotenuse is cos θ, so x = r cos θ.</w:t>
+      </w:r>
+    </w:p>
+    <w:p>
+      <w:pPr>
+        <w:pStyle w:val="ListParagraph"/>
+        <w:numPr>
+          <w:ilvl w:val="0"/>
+          <w:numId w:val="2"/>
+        </w:numPr>
+        <w:spacing w:after="80"/>
+      </w:pPr>
+      <w:r>
+        <w:rPr>
+          <w:rFonts w:ascii="Calibri" w:cs="Calibri" w:eastAsia="Calibri" w:hAnsi="Calibri"/>
+          <w:sz w:val="22"/>
+          <w:szCs w:val="22"/>
+        </w:rPr>
+        <w:t xml:space="preserve">Step 2 — opposite over hypotenuse is sin θ, so y = r sin θ.</w:t>
+      </w:r>
+    </w:p>
+    <w:p>
+      <w:pPr>
+        <w:pStyle w:val="ListParagraph"/>
+        <w:numPr>
+          <w:ilvl w:val="0"/>
+          <w:numId w:val="2"/>
+        </w:numPr>
+        <w:spacing w:after="80"/>
+      </w:pPr>
+      <w:r>
+        <w:rPr>
+          <w:rFonts w:ascii="Calibri" w:cs="Calibri" w:eastAsia="Calibri" w:hAnsi="Calibri"/>
+          <w:sz w:val="22"/>
+          <w:szCs w:val="22"/>
+        </w:rPr>
+        <w:t xml:space="preserve">Numeric example (from the next slide's z₂): r = 4, θ = π/6 (30°). Step 3 — cos(π/6) = √3/2 = 0.8660, so x = 4(0.8660) = 3.464. Step 4 — sin(π/6) = 1/2, so y = 4(0.5) = 2.</w:t>
+      </w:r>
+    </w:p>
+    <w:p>
+      <w:pPr>
+        <w:pStyle w:val="ListParagraph"/>
+        <w:numPr>
+          <w:ilvl w:val="0"/>
+          <w:numId w:val="2"/>
+        </w:numPr>
+        <w:spacing w:after="80"/>
+      </w:pPr>
+      <w:r>
+        <w:rPr>
+          <w:rFonts w:ascii="Calibri" w:cs="Calibri" w:eastAsia="Calibri" w:hAnsi="Calibri"/>
+          <w:sz w:val="22"/>
+          <w:szCs w:val="22"/>
+        </w:rPr>
+        <w:t xml:space="preserve">Check: r = √(3.464² + 2²) = √(12 + 4) = √16 = 4 ✓.</w:t>
+      </w:r>
+    </w:p>
+    <w:p>
+      <w:pPr>
+        <w:pStyle w:val="ListParagraph"/>
+        <w:numPr>
+          <w:ilvl w:val="0"/>
+          <w:numId w:val="2"/>
+        </w:numPr>
+        <w:spacing w:after="80"/>
+      </w:pPr>
+      <w:r>
+        <w:rPr>
+          <w:rFonts w:ascii="Calibri" w:cs="Calibri" w:eastAsia="Calibri" w:hAnsi="Calibri"/>
+          <w:sz w:val="22"/>
+          <w:szCs w:val="22"/>
+        </w:rPr>
+        <w:t xml:space="preserve">No quadrant worry in this direction: cos and sin already carry the signs. Example r = 2, θ = 3π/4 (135°): x = 2cos 135° = −1.414, y = 2 sin 135° = +1.414, second quadrant automatically.</w:t>
       </w:r>
     </w:p>
     <w:p>
@@ -544,53 +696,133 @@
           <w:sz w:val="22"/>
           <w:szCs w:val="22"/>
         </w:rPr>
-        <w:t xml:space="preserve">r = √(x² + y²) is Pythagoras on the same triangle; tan θ = y/x because y/x = (r sin θ)/(r cos θ).</w:t>
-      </w:r>
-    </w:p>
-    <w:p>
-      <w:pPr>
-        <w:pStyle w:val="ListParagraph"/>
-        <w:numPr>
-          <w:ilvl w:val="0"/>
-          <w:numId w:val="2"/>
-        </w:numPr>
-        <w:spacing w:after="80"/>
-      </w:pPr>
-      <w:r>
-        <w:rPr>
-          <w:rFonts w:ascii="Calibri" w:cs="Calibri" w:eastAsia="Calibri" w:hAnsi="Calibri"/>
-          <w:sz w:val="22"/>
-          <w:szCs w:val="22"/>
-        </w:rPr>
-        <w:t xml:space="preserve">arctan returns values only in (−π/2, π/2), the right half-plane. Add π if and only if x &lt; 0. If x = 0: θ = +π/2 for y &gt; 0, −π/2 for y &lt; 0. In code use atan2(y, x).</w:t>
-      </w:r>
-    </w:p>
-    <w:p>
-      <w:pPr>
-        <w:pBdr>
-          <w:left w:val="single" w:color="7A1A1A" w:sz="18" w:space="8"/>
-        </w:pBdr>
-        <w:spacing w:after="140" w:before="100"/>
-        <w:ind w:left="360"/>
-      </w:pPr>
-      <w:r>
-        <w:rPr>
-          <w:rFonts w:ascii="Calibri" w:cs="Calibri" w:eastAsia="Calibri" w:hAnsi="Calibri"/>
-          <w:b/>
-          <w:bCs/>
-          <w:color w:val="7A1A1A"/>
-          <w:sz w:val="22"/>
-          <w:szCs w:val="22"/>
-        </w:rPr>
-        <w:t xml:space="preserve">Common error: </w:t>
-      </w:r>
-      <w:r>
-        <w:rPr>
-          <w:rFonts w:ascii="Calibri" w:cs="Calibri" w:eastAsia="Calibri" w:hAnsi="Calibri"/>
-          <w:sz w:val="22"/>
-          <w:szCs w:val="22"/>
-        </w:rPr>
-        <w:t xml:space="preserve">Forgetting the π. For (−5, 2) the bare arctan gives −0.3805 (fourth quadrant) but the point is in the second quadrant.</w:t>
+        <w:t xml:space="preserve">Given: (x, y). Wanted: (r, θ). Same right triangle, legs |x| and |y|.</w:t>
+      </w:r>
+    </w:p>
+    <w:p>
+      <w:pPr>
+        <w:pStyle w:val="ListParagraph"/>
+        <w:numPr>
+          <w:ilvl w:val="0"/>
+          <w:numId w:val="2"/>
+        </w:numPr>
+        <w:spacing w:after="80"/>
+      </w:pPr>
+      <w:r>
+        <w:rPr>
+          <w:rFonts w:ascii="Calibri" w:cs="Calibri" w:eastAsia="Calibri" w:hAnsi="Calibri"/>
+          <w:sz w:val="22"/>
+          <w:szCs w:val="22"/>
+        </w:rPr>
+        <w:t xml:space="preserve">Step 1 — Pythagoras: r = √(x² + y²). Always take the positive root.</w:t>
+      </w:r>
+    </w:p>
+    <w:p>
+      <w:pPr>
+        <w:pStyle w:val="ListParagraph"/>
+        <w:numPr>
+          <w:ilvl w:val="0"/>
+          <w:numId w:val="2"/>
+        </w:numPr>
+        <w:spacing w:after="80"/>
+      </w:pPr>
+      <w:r>
+        <w:rPr>
+          <w:rFonts w:ascii="Calibri" w:cs="Calibri" w:eastAsia="Calibri" w:hAnsi="Calibri"/>
+          <w:sz w:val="22"/>
+          <w:szCs w:val="22"/>
+        </w:rPr>
+        <w:t xml:space="preserve">Step 2 — tan θ = y/x because y/x = (r sin θ)/(r cos θ) = sin θ / cos θ = tan θ. So θ = arctan(y/x) — but read the next line.</w:t>
+      </w:r>
+    </w:p>
+    <w:p>
+      <w:pPr>
+        <w:pStyle w:val="ListParagraph"/>
+        <w:numPr>
+          <w:ilvl w:val="0"/>
+          <w:numId w:val="2"/>
+        </w:numPr>
+        <w:spacing w:after="80"/>
+      </w:pPr>
+      <w:r>
+        <w:rPr>
+          <w:rFonts w:ascii="Calibri" w:cs="Calibri" w:eastAsia="Calibri" w:hAnsi="Calibri"/>
+          <w:sz w:val="22"/>
+          <w:szCs w:val="22"/>
+        </w:rPr>
+        <w:t xml:space="preserve">Step 3 — what arctan means: arctan(u) is the angle in (−π/2, π/2) whose tangent is u. It only sees the ratio y/x, so it cannot tell (x, y) from (−x, −y): both give the same ratio. It always answers in the right half-plane (x &gt; 0).</w:t>
+      </w:r>
+    </w:p>
+    <w:p>
+      <w:pPr>
+        <w:pStyle w:val="ListParagraph"/>
+        <w:numPr>
+          <w:ilvl w:val="0"/>
+          <w:numId w:val="2"/>
+        </w:numPr>
+        <w:spacing w:after="80"/>
+      </w:pPr>
+      <w:r>
+        <w:rPr>
+          <w:rFonts w:ascii="Calibri" w:cs="Calibri" w:eastAsia="Calibri" w:hAnsi="Calibri"/>
+          <w:sz w:val="22"/>
+          <w:szCs w:val="22"/>
+        </w:rPr>
+        <w:t xml:space="preserve">Step 4 — quadrant decision: if x &gt; 0, keep arctan(y/x). If x &lt; 0, add π (half a turn) to move to the left half-plane. If x = 0: θ = +π/2 for y &gt; 0, θ = −π/2 for y &lt; 0.</w:t>
+      </w:r>
+    </w:p>
+    <w:p>
+      <w:pPr>
+        <w:pStyle w:val="ListParagraph"/>
+        <w:numPr>
+          <w:ilvl w:val="0"/>
+          <w:numId w:val="2"/>
+        </w:numPr>
+        <w:spacing w:after="80"/>
+      </w:pPr>
+      <w:r>
+        <w:rPr>
+          <w:rFonts w:ascii="Calibri" w:cs="Calibri" w:eastAsia="Calibri" w:hAnsi="Calibri"/>
+          <w:sz w:val="22"/>
+          <w:szCs w:val="22"/>
+        </w:rPr>
+        <w:t xml:space="preserve">Step 5 — atan2(y, x) is the calculator/Python function that does steps 3–4 for you: it takes y and x separately and returns the angle in (−π, π].</w:t>
+      </w:r>
+    </w:p>
+    <w:p>
+      <w:pPr>
+        <w:pStyle w:val="ListParagraph"/>
+        <w:numPr>
+          <w:ilvl w:val="0"/>
+          <w:numId w:val="2"/>
+        </w:numPr>
+        <w:spacing w:after="80"/>
+      </w:pPr>
+      <w:r>
+        <w:rPr>
+          <w:rFonts w:ascii="Calibri" w:cs="Calibri" w:eastAsia="Calibri" w:hAnsi="Calibri"/>
+          <w:sz w:val="22"/>
+          <w:szCs w:val="22"/>
+        </w:rPr>
+        <w:t xml:space="preserve">Test case (−5, 2): ratio y/x = 2/(−5) = −0.4, arctan(−0.4) = −0.3805 rad (−21.8°, fourth quadrant). x = −5 &lt; 0, so add π: −0.3805 + 3.1416 = 2.7611 rad = 158.2°. The point really is up-left, so 158.2° is right and −21.8° is wrong.</w:t>
+      </w:r>
+    </w:p>
+    <w:p>
+      <w:pPr>
+        <w:pStyle w:val="ListParagraph"/>
+        <w:numPr>
+          <w:ilvl w:val="0"/>
+          <w:numId w:val="2"/>
+        </w:numPr>
+        <w:spacing w:after="80"/>
+      </w:pPr>
+      <w:r>
+        <w:rPr>
+          <w:rFonts w:ascii="Calibri" w:cs="Calibri" w:eastAsia="Calibri" w:hAnsi="Calibri"/>
+          <w:sz w:val="22"/>
+          <w:szCs w:val="22"/>
+        </w:rPr>
+        <w:t xml:space="preserve">Pitfall: forgetting the π when x &lt; 0.</w:t>
       </w:r>
     </w:p>
     <w:p>
@@ -638,25 +870,79 @@
           <w:sz w:val="22"/>
           <w:szCs w:val="22"/>
         </w:rPr>
-        <w:t xml:space="preserve">2π rad = 360°; angles differing by an integer multiple of 2π name the same number. Pick [0, 2π) or (−π, π] and stay consistent in a problem.</w:t>
-      </w:r>
-    </w:p>
-    <w:p>
-      <w:pPr>
-        <w:pStyle w:val="ListParagraph"/>
-        <w:numPr>
-          <w:ilvl w:val="0"/>
-          <w:numId w:val="2"/>
-        </w:numPr>
-        <w:spacing w:after="80"/>
-      </w:pPr>
-      <w:r>
-        <w:rPr>
-          <w:rFonts w:ascii="Calibri" w:cs="Calibri" w:eastAsia="Calibri" w:hAnsi="Calibri"/>
-          <w:sz w:val="22"/>
-          <w:szCs w:val="22"/>
-        </w:rPr>
-        <w:t xml:space="preserve">The diagram marks 0, π/2, π, 3π/2 on the unit circle and the positive (counter-clockwise) direction.</w:t>
+        <w:t xml:space="preserve">Notation: 'α mod 2π' means: add or subtract whole turns of 2π until the angle lands in the chosen range. Example: 7π/3 mod 2π = 7π/3 − 2π = π/3. Another: −π/4 mod 2π = −π/4 + 2π = 7π/4.</w:t>
+      </w:r>
+    </w:p>
+    <w:p>
+      <w:pPr>
+        <w:pStyle w:val="ListParagraph"/>
+        <w:numPr>
+          <w:ilvl w:val="0"/>
+          <w:numId w:val="2"/>
+        </w:numPr>
+        <w:spacing w:after="80"/>
+      </w:pPr>
+      <w:r>
+        <w:rPr>
+          <w:rFonts w:ascii="Calibri" w:cs="Calibri" w:eastAsia="Calibri" w:hAnsi="Calibri"/>
+          <w:sz w:val="22"/>
+          <w:szCs w:val="22"/>
+        </w:rPr>
+        <w:t xml:space="preserve">Fact: 2π rad = 360°, so 1 rad = 180°/π = 57.30° and 1° = π/180 rad.</w:t>
+      </w:r>
+    </w:p>
+    <w:p>
+      <w:pPr>
+        <w:pStyle w:val="ListParagraph"/>
+        <w:numPr>
+          <w:ilvl w:val="0"/>
+          <w:numId w:val="2"/>
+        </w:numPr>
+        <w:spacing w:after="80"/>
+      </w:pPr>
+      <w:r>
+        <w:rPr>
+          <w:rFonts w:ascii="Calibri" w:cs="Calibri" w:eastAsia="Calibri" w:hAnsi="Calibri"/>
+          <w:sz w:val="22"/>
+          <w:szCs w:val="22"/>
+        </w:rPr>
+        <w:t xml:space="preserve">Two ranges: [0, 2π) or (−π, π]. Pick one per problem. The bracket '[' includes the endpoint, ')' excludes it: [0, 2π) contains 0 but not 2π.</w:t>
+      </w:r>
+    </w:p>
+    <w:p>
+      <w:pPr>
+        <w:pStyle w:val="ListParagraph"/>
+        <w:numPr>
+          <w:ilvl w:val="0"/>
+          <w:numId w:val="2"/>
+        </w:numPr>
+        <w:spacing w:after="80"/>
+      </w:pPr>
+      <w:r>
+        <w:rPr>
+          <w:rFonts w:ascii="Calibri" w:cs="Calibri" w:eastAsia="Calibri" w:hAnsi="Calibri"/>
+          <w:sz w:val="22"/>
+          <w:szCs w:val="22"/>
+        </w:rPr>
+        <w:t xml:space="preserve">Same direction, two ranges: w = −3 − 4j has θ = 4.0689 rad in [0, 2π). Subtract 2π: 4.0689 − 6.2832 = −2.2143 rad, which is the value in (−π, π] (what atan2 returns). Same arrow, same number.</w:t>
+      </w:r>
+    </w:p>
+    <w:p>
+      <w:pPr>
+        <w:pStyle w:val="ListParagraph"/>
+        <w:numPr>
+          <w:ilvl w:val="0"/>
+          <w:numId w:val="2"/>
+        </w:numPr>
+        <w:spacing w:after="80"/>
+      </w:pPr>
+      <w:r>
+        <w:rPr>
+          <w:rFonts w:ascii="Calibri" w:cs="Calibri" w:eastAsia="Calibri" w:hAnsi="Calibri"/>
+          <w:sz w:val="22"/>
+          <w:szCs w:val="22"/>
+        </w:rPr>
+        <w:t xml:space="preserve">Quick degree table to point at on the figure: 0 → 0°, π/2 → 90°, π → 180°, 3π/2 → 270°, counter-clockwise is positive.</w:t>
       </w:r>
     </w:p>
     <w:p>
@@ -704,71 +990,187 @@
           <w:sz w:val="22"/>
           <w:szCs w:val="22"/>
         </w:rPr>
-        <w:t xml:space="preserve">Given Re{z₁} = −5, Im{z₁} = 2 and |z₂| = 4, ∠z₂ = π/6. About 5 min.</w:t>
-      </w:r>
-    </w:p>
-    <w:p>
-      <w:pPr>
-        <w:pStyle w:val="ListParagraph"/>
-        <w:numPr>
-          <w:ilvl w:val="0"/>
-          <w:numId w:val="2"/>
-        </w:numPr>
-        <w:spacing w:after="80"/>
-      </w:pPr>
-      <w:r>
-        <w:rPr>
-          <w:rFonts w:ascii="Calibri" w:cs="Calibri" w:eastAsia="Calibri" w:hAnsi="Calibri"/>
-          <w:sz w:val="22"/>
-          <w:szCs w:val="22"/>
-        </w:rPr>
-        <w:t xml:space="preserve">Step 1 (z₁ to polar): |z₁| = √(25 + 4) = √29 ≈ 5.385. arctan(2/(−5)) = arctan(−0.4) = −0.3805; add π because x &lt; 0: θ₁ = 2.7611 rad = 2.7611·180°/π = 158.2°.</w:t>
-      </w:r>
-    </w:p>
-    <w:p>
-      <w:pPr>
-        <w:pStyle w:val="ListParagraph"/>
-        <w:numPr>
-          <w:ilvl w:val="0"/>
-          <w:numId w:val="2"/>
-        </w:numPr>
-        <w:spacing w:after="80"/>
-      </w:pPr>
-      <w:r>
-        <w:rPr>
-          <w:rFonts w:ascii="Calibri" w:cs="Calibri" w:eastAsia="Calibri" w:hAnsi="Calibri"/>
-          <w:sz w:val="22"/>
-          <w:szCs w:val="22"/>
-        </w:rPr>
-        <w:t xml:space="preserve">Step 2 (z₂ to Cartesian): Re = 4 cos(π/6) = 4·√3/2 = 2√3 ≈ 3.464; Im = 4 sin(π/6) = 4·½ = 2.</w:t>
-      </w:r>
-    </w:p>
-    <w:p>
-      <w:pPr>
-        <w:pBdr>
-          <w:left w:val="single" w:color="7A1A1A" w:sz="18" w:space="8"/>
-        </w:pBdr>
-        <w:spacing w:after="140" w:before="100"/>
-        <w:ind w:left="360"/>
-      </w:pPr>
-      <w:r>
-        <w:rPr>
-          <w:rFonts w:ascii="Calibri" w:cs="Calibri" w:eastAsia="Calibri" w:hAnsi="Calibri"/>
-          <w:b/>
-          <w:bCs/>
-          <w:color w:val="7A1A1A"/>
-          <w:sz w:val="22"/>
-          <w:szCs w:val="22"/>
-        </w:rPr>
-        <w:t xml:space="preserve">Figure (notebook cell 7): </w:t>
-      </w:r>
-      <w:r>
-        <w:rPr>
-          <w:rFonts w:ascii="Calibri" w:cs="Calibri" w:eastAsia="Calibri" w:hAnsi="Calibri"/>
-          <w:sz w:val="22"/>
-          <w:szCs w:val="22"/>
-        </w:rPr>
-        <w:t xml:space="preserve">z₁ at (−5, 2) labeled |z₁| = 5.385, ∠ = 158.2°; z₂ at 30° with |z₂| = 4 and height 2. Point out that 158.2° is more than 90° precisely because z₁ is left of the imaginary axis.</w:t>
+        <w:t xml:space="preserve">Given: z₁ has Re{z₁} = −5, Im{z₁} = 2 (Cartesian). z₂ has |z₂| = 4, ∠z₂ = π/6 (polar). Task: plot both. About 5 min.</w:t>
+      </w:r>
+    </w:p>
+    <w:p>
+      <w:pPr>
+        <w:pStyle w:val="ListParagraph"/>
+        <w:numPr>
+          <w:ilvl w:val="0"/>
+          <w:numId w:val="2"/>
+        </w:numPr>
+        <w:spacing w:after="80"/>
+      </w:pPr>
+      <w:r>
+        <w:rPr>
+          <w:rFonts w:ascii="Calibri" w:cs="Calibri" w:eastAsia="Calibri" w:hAnsi="Calibri"/>
+          <w:sz w:val="22"/>
+          <w:szCs w:val="22"/>
+        </w:rPr>
+        <w:t xml:space="preserve">Plan: to plot z₁ just mark (−5, 2); we also find its polar address so we know its length and angle. For z₂ we convert polar → Cartesian to read off its coordinates.</w:t>
+      </w:r>
+    </w:p>
+    <w:p>
+      <w:pPr>
+        <w:pStyle w:val="ListParagraph"/>
+        <w:numPr>
+          <w:ilvl w:val="0"/>
+          <w:numId w:val="2"/>
+        </w:numPr>
+        <w:spacing w:after="80"/>
+      </w:pPr>
+      <w:r>
+        <w:rPr>
+          <w:rFonts w:ascii="Calibri" w:cs="Calibri" w:eastAsia="Calibri" w:hAnsi="Calibri"/>
+          <w:sz w:val="22"/>
+          <w:szCs w:val="22"/>
+        </w:rPr>
+        <w:t xml:space="preserve">Step 1 — modulus of z₁: |z₁| = √((−5)² + 2²). Square each: (−5)² = 25 (the minus sign disappears), 2² = 4. Sum 25 + 4 = 29. So |z₁| = √29 = 5.385.</w:t>
+      </w:r>
+    </w:p>
+    <w:p>
+      <w:pPr>
+        <w:pStyle w:val="ListParagraph"/>
+        <w:numPr>
+          <w:ilvl w:val="0"/>
+          <w:numId w:val="2"/>
+        </w:numPr>
+        <w:spacing w:after="80"/>
+      </w:pPr>
+      <w:r>
+        <w:rPr>
+          <w:rFonts w:ascii="Calibri" w:cs="Calibri" w:eastAsia="Calibri" w:hAnsi="Calibri"/>
+          <w:sz w:val="22"/>
+          <w:szCs w:val="22"/>
+        </w:rPr>
+        <w:t xml:space="preserve">Step 2 — ratio y/x = 2/(−5) = −0.4. arctan(−0.4) = −0.3805 rad (that is −21.8°, fourth quadrant).</w:t>
+      </w:r>
+    </w:p>
+    <w:p>
+      <w:pPr>
+        <w:pStyle w:val="ListParagraph"/>
+        <w:numPr>
+          <w:ilvl w:val="0"/>
+          <w:numId w:val="2"/>
+        </w:numPr>
+        <w:spacing w:after="80"/>
+      </w:pPr>
+      <w:r>
+        <w:rPr>
+          <w:rFonts w:ascii="Calibri" w:cs="Calibri" w:eastAsia="Calibri" w:hAnsi="Calibri"/>
+          <w:sz w:val="22"/>
+          <w:szCs w:val="22"/>
+        </w:rPr>
+        <w:t xml:space="preserve">Step 3 — quadrant decision: x = −5 &lt; 0, the point is in the second quadrant (left, up), so add π: θ₁ = −0.3805 + 3.1416 = 2.7611 rad.</w:t>
+      </w:r>
+    </w:p>
+    <w:p>
+      <w:pPr>
+        <w:pStyle w:val="ListParagraph"/>
+        <w:numPr>
+          <w:ilvl w:val="0"/>
+          <w:numId w:val="2"/>
+        </w:numPr>
+        <w:spacing w:after="80"/>
+      </w:pPr>
+      <w:r>
+        <w:rPr>
+          <w:rFonts w:ascii="Calibri" w:cs="Calibri" w:eastAsia="Calibri" w:hAnsi="Calibri"/>
+          <w:sz w:val="22"/>
+          <w:szCs w:val="22"/>
+        </w:rPr>
+        <w:t xml:space="preserve">Step 4 — to degrees: 2.7611 × 180°/π = 2.7611 × 57.296 = 158.2°. More than 90° because z₁ is left of the imaginary axis.</w:t>
+      </w:r>
+    </w:p>
+    <w:p>
+      <w:pPr>
+        <w:pStyle w:val="ListParagraph"/>
+        <w:numPr>
+          <w:ilvl w:val="0"/>
+          <w:numId w:val="2"/>
+        </w:numPr>
+        <w:spacing w:after="80"/>
+      </w:pPr>
+      <w:r>
+        <w:rPr>
+          <w:rFonts w:ascii="Calibri" w:cs="Calibri" w:eastAsia="Calibri" w:hAnsi="Calibri"/>
+          <w:sz w:val="22"/>
+          <w:szCs w:val="22"/>
+        </w:rPr>
+        <w:t xml:space="preserve">Check z₁: 5.385 cos(2.7611) = 5.385(−0.9285) = −5.00 ✓; 5.385 sin(2.7611) = 5.385(0.3714) = 2.00 ✓.</w:t>
+      </w:r>
+    </w:p>
+    <w:p>
+      <w:pPr>
+        <w:pStyle w:val="ListParagraph"/>
+        <w:numPr>
+          <w:ilvl w:val="0"/>
+          <w:numId w:val="2"/>
+        </w:numPr>
+        <w:spacing w:after="80"/>
+      </w:pPr>
+      <w:r>
+        <w:rPr>
+          <w:rFonts w:ascii="Calibri" w:cs="Calibri" w:eastAsia="Calibri" w:hAnsi="Calibri"/>
+          <w:sz w:val="22"/>
+          <w:szCs w:val="22"/>
+        </w:rPr>
+        <w:t xml:space="preserve">Step 5 — z₂ to Cartesian: x = 4 cos(π/6) = 4(√3/2) = 2√3 = 3.464.</w:t>
+      </w:r>
+    </w:p>
+    <w:p>
+      <w:pPr>
+        <w:pStyle w:val="ListParagraph"/>
+        <w:numPr>
+          <w:ilvl w:val="0"/>
+          <w:numId w:val="2"/>
+        </w:numPr>
+        <w:spacing w:after="80"/>
+      </w:pPr>
+      <w:r>
+        <w:rPr>
+          <w:rFonts w:ascii="Calibri" w:cs="Calibri" w:eastAsia="Calibri" w:hAnsi="Calibri"/>
+          <w:sz w:val="22"/>
+          <w:szCs w:val="22"/>
+        </w:rPr>
+        <w:t xml:space="preserve">Step 6 — y = 4 sin(π/6) = 4(1/2) = 2. So z₂ = 3.464 + 2j.</w:t>
+      </w:r>
+    </w:p>
+    <w:p>
+      <w:pPr>
+        <w:pStyle w:val="ListParagraph"/>
+        <w:numPr>
+          <w:ilvl w:val="0"/>
+          <w:numId w:val="2"/>
+        </w:numPr>
+        <w:spacing w:after="80"/>
+      </w:pPr>
+      <w:r>
+        <w:rPr>
+          <w:rFonts w:ascii="Calibri" w:cs="Calibri" w:eastAsia="Calibri" w:hAnsi="Calibri"/>
+          <w:sz w:val="22"/>
+          <w:szCs w:val="22"/>
+        </w:rPr>
+        <w:t xml:space="preserve">Check z₂: √(3.464² + 2²) = √(12.0 + 4) = 4 ✓; angle arctan(2/3.464) = arctan(0.5774) = 0.5236 = π/6 ✓.</w:t>
+      </w:r>
+    </w:p>
+    <w:p>
+      <w:pPr>
+        <w:pStyle w:val="ListParagraph"/>
+        <w:numPr>
+          <w:ilvl w:val="0"/>
+          <w:numId w:val="2"/>
+        </w:numPr>
+        <w:spacing w:after="80"/>
+      </w:pPr>
+      <w:r>
+        <w:rPr>
+          <w:rFonts w:ascii="Calibri" w:cs="Calibri" w:eastAsia="Calibri" w:hAnsi="Calibri"/>
+          <w:sz w:val="22"/>
+          <w:szCs w:val="22"/>
+        </w:rPr>
+        <w:t xml:space="preserve">Figure: z₁ at (−5, 2) labelled 5.385 and 158.2°; z₂ at 30° above the real axis, length 4, height 2. Point at the 158.2° arc sweeping past the imaginary axis.</w:t>
       </w:r>
     </w:p>
     <w:p>
@@ -816,89 +1218,151 @@
           <w:sz w:val="22"/>
           <w:szCs w:val="22"/>
         </w:rPr>
-        <w:t xml:space="preserve">w = −3 − 4j, so x = −3, y = −4: third quadrant. About 4 min.</w:t>
-      </w:r>
-    </w:p>
-    <w:p>
-      <w:pPr>
-        <w:pStyle w:val="ListParagraph"/>
-        <w:numPr>
-          <w:ilvl w:val="0"/>
-          <w:numId w:val="2"/>
-        </w:numPr>
-        <w:spacing w:after="80"/>
-      </w:pPr>
-      <w:r>
-        <w:rPr>
-          <w:rFonts w:ascii="Calibri" w:cs="Calibri" w:eastAsia="Calibri" w:hAnsi="Calibri"/>
-          <w:sz w:val="22"/>
-          <w:szCs w:val="22"/>
-        </w:rPr>
-        <w:t xml:space="preserve">r = √(9 + 16) = √25 = 5.</w:t>
-      </w:r>
-    </w:p>
-    <w:p>
-      <w:pPr>
-        <w:pStyle w:val="ListParagraph"/>
-        <w:numPr>
-          <w:ilvl w:val="0"/>
-          <w:numId w:val="2"/>
-        </w:numPr>
-        <w:spacing w:after="80"/>
-      </w:pPr>
-      <w:r>
-        <w:rPr>
-          <w:rFonts w:ascii="Calibri" w:cs="Calibri" w:eastAsia="Calibri" w:hAnsi="Calibri"/>
-          <w:sz w:val="22"/>
-          <w:szCs w:val="22"/>
-        </w:rPr>
-        <w:t xml:space="preserve">arctan((−4)/(−3)) = arctan(4/3) = 0.9273; the two minus signs cancel in the ratio, so the bare arctan lands in the first quadrant — add π: θ = 0.9273 + π = 4.0689 ≈ 4.07 rad ≈ 233.1°.</w:t>
-      </w:r>
-    </w:p>
-    <w:p>
-      <w:pPr>
-        <w:pStyle w:val="ListParagraph"/>
-        <w:numPr>
-          <w:ilvl w:val="0"/>
-          <w:numId w:val="2"/>
-        </w:numPr>
-        <w:spacing w:after="80"/>
-      </w:pPr>
-      <w:r>
-        <w:rPr>
-          <w:rFonts w:ascii="Calibri" w:cs="Calibri" w:eastAsia="Calibri" w:hAnsi="Calibri"/>
-          <w:sz w:val="22"/>
-          <w:szCs w:val="22"/>
-        </w:rPr>
-        <w:t xml:space="preserve">Check: 5 cos 4.0689 = −3 and 5 sin 4.0689 = −4.</w:t>
-      </w:r>
-    </w:p>
-    <w:p>
-      <w:pPr>
-        <w:pBdr>
-          <w:left w:val="single" w:color="7A1A1A" w:sz="18" w:space="8"/>
-        </w:pBdr>
-        <w:spacing w:after="140" w:before="100"/>
-        <w:ind w:left="360"/>
-      </w:pPr>
-      <w:r>
-        <w:rPr>
-          <w:rFonts w:ascii="Calibri" w:cs="Calibri" w:eastAsia="Calibri" w:hAnsi="Calibri"/>
-          <w:b/>
-          <w:bCs/>
-          <w:color w:val="7A1A1A"/>
-          <w:sz w:val="22"/>
-          <w:szCs w:val="22"/>
-        </w:rPr>
-        <w:t xml:space="preserve">Common error: </w:t>
-      </w:r>
-      <w:r>
-        <w:rPr>
-          <w:rFonts w:ascii="Calibri" w:cs="Calibri" w:eastAsia="Calibri" w:hAnsi="Calibri"/>
-          <w:sz w:val="22"/>
-          <w:szCs w:val="22"/>
-        </w:rPr>
-        <w:t xml:space="preserve">Reporting 0.927 rad (53.1°): that is the first-quadrant mirror of w. The figure (hand-drawn) shows the long counter-clockwise sweep of 4.07 rad.</w:t>
+        <w:t xml:space="preserve">Given: w = −3 − 4j. Task: polar form. Step 1 — identify: x = −3, y = −4, both negative, so w is in the third quadrant (left and down).</w:t>
+      </w:r>
+    </w:p>
+    <w:p>
+      <w:pPr>
+        <w:pStyle w:val="ListParagraph"/>
+        <w:numPr>
+          <w:ilvl w:val="0"/>
+          <w:numId w:val="2"/>
+        </w:numPr>
+        <w:spacing w:after="80"/>
+      </w:pPr>
+      <w:r>
+        <w:rPr>
+          <w:rFonts w:ascii="Calibri" w:cs="Calibri" w:eastAsia="Calibri" w:hAnsi="Calibri"/>
+          <w:sz w:val="22"/>
+          <w:szCs w:val="22"/>
+        </w:rPr>
+        <w:t xml:space="preserve">Step 2 — modulus: (−3)² = 9, (−4)² = 16, sum = 25, r = √25 = 5.</w:t>
+      </w:r>
+    </w:p>
+    <w:p>
+      <w:pPr>
+        <w:pStyle w:val="ListParagraph"/>
+        <w:numPr>
+          <w:ilvl w:val="0"/>
+          <w:numId w:val="2"/>
+        </w:numPr>
+        <w:spacing w:after="80"/>
+      </w:pPr>
+      <w:r>
+        <w:rPr>
+          <w:rFonts w:ascii="Calibri" w:cs="Calibri" w:eastAsia="Calibri" w:hAnsi="Calibri"/>
+          <w:sz w:val="22"/>
+          <w:szCs w:val="22"/>
+        </w:rPr>
+        <w:t xml:space="preserve">Step 3 — ratio: y/x = (−4)/(−3) = +4/3 = 1.3333. The two minus signs cancel, so the ratio looks like a first-quadrant point.</w:t>
+      </w:r>
+    </w:p>
+    <w:p>
+      <w:pPr>
+        <w:pStyle w:val="ListParagraph"/>
+        <w:numPr>
+          <w:ilvl w:val="0"/>
+          <w:numId w:val="2"/>
+        </w:numPr>
+        <w:spacing w:after="80"/>
+      </w:pPr>
+      <w:r>
+        <w:rPr>
+          <w:rFonts w:ascii="Calibri" w:cs="Calibri" w:eastAsia="Calibri" w:hAnsi="Calibri"/>
+          <w:sz w:val="22"/>
+          <w:szCs w:val="22"/>
+        </w:rPr>
+        <w:t xml:space="preserve">Step 4 — arctan(4/3) = 0.9273 rad (53.13°). This is the angle of 3 + 4j, the mirror image through the origin, NOT of w.</w:t>
+      </w:r>
+    </w:p>
+    <w:p>
+      <w:pPr>
+        <w:pStyle w:val="ListParagraph"/>
+        <w:numPr>
+          <w:ilvl w:val="0"/>
+          <w:numId w:val="2"/>
+        </w:numPr>
+        <w:spacing w:after="80"/>
+      </w:pPr>
+      <w:r>
+        <w:rPr>
+          <w:rFonts w:ascii="Calibri" w:cs="Calibri" w:eastAsia="Calibri" w:hAnsi="Calibri"/>
+          <w:sz w:val="22"/>
+          <w:szCs w:val="22"/>
+        </w:rPr>
+        <w:t xml:space="preserve">Step 5 — quadrant decision: x = −3 &lt; 0, so add π: θ = 0.9273 + 3.1416 = 4.0689 rad. In degrees: 53.13° + 180° = 233.13°.</w:t>
+      </w:r>
+    </w:p>
+    <w:p>
+      <w:pPr>
+        <w:pStyle w:val="ListParagraph"/>
+        <w:numPr>
+          <w:ilvl w:val="0"/>
+          <w:numId w:val="2"/>
+        </w:numPr>
+        <w:spacing w:after="80"/>
+      </w:pPr>
+      <w:r>
+        <w:rPr>
+          <w:rFonts w:ascii="Calibri" w:cs="Calibri" w:eastAsia="Calibri" w:hAnsi="Calibri"/>
+          <w:sz w:val="22"/>
+          <w:szCs w:val="22"/>
+        </w:rPr>
+        <w:t xml:space="preserve">Result: w = (5, 4.07 rad) = (5, 233.1°).</w:t>
+      </w:r>
+    </w:p>
+    <w:p>
+      <w:pPr>
+        <w:pStyle w:val="ListParagraph"/>
+        <w:numPr>
+          <w:ilvl w:val="0"/>
+          <w:numId w:val="2"/>
+        </w:numPr>
+        <w:spacing w:after="80"/>
+      </w:pPr>
+      <w:r>
+        <w:rPr>
+          <w:rFonts w:ascii="Calibri" w:cs="Calibri" w:eastAsia="Calibri" w:hAnsi="Calibri"/>
+          <w:sz w:val="22"/>
+          <w:szCs w:val="22"/>
+        </w:rPr>
+        <w:t xml:space="preserve">Check by converting back: x = 5 cos(4.0689) = 5(−0.6000) = −3.00 ✓; y = 5 sin(4.0689) = 5(−0.8000) = −4.00 ✓.</w:t>
+      </w:r>
+    </w:p>
+    <w:p>
+      <w:pPr>
+        <w:pStyle w:val="ListParagraph"/>
+        <w:numPr>
+          <w:ilvl w:val="0"/>
+          <w:numId w:val="2"/>
+        </w:numPr>
+        <w:spacing w:after="80"/>
+      </w:pPr>
+      <w:r>
+        <w:rPr>
+          <w:rFonts w:ascii="Calibri" w:cs="Calibri" w:eastAsia="Calibri" w:hAnsi="Calibri"/>
+          <w:sz w:val="22"/>
+          <w:szCs w:val="22"/>
+        </w:rPr>
+        <w:t xml:space="preserve">Second check: the same angle in (−π, π] is 4.0689 − 2π = −2.2143 rad = −126.9° (what atan2(−4, −3) returns).</w:t>
+      </w:r>
+    </w:p>
+    <w:p>
+      <w:pPr>
+        <w:pStyle w:val="ListParagraph"/>
+        <w:numPr>
+          <w:ilvl w:val="0"/>
+          <w:numId w:val="2"/>
+        </w:numPr>
+        <w:spacing w:after="80"/>
+      </w:pPr>
+      <w:r>
+        <w:rPr>
+          <w:rFonts w:ascii="Calibri" w:cs="Calibri" w:eastAsia="Calibri" w:hAnsi="Calibri"/>
+          <w:sz w:val="22"/>
+          <w:szCs w:val="22"/>
+        </w:rPr>
+        <w:t xml:space="preserve">Pitfall: answering 0.927 rad (53.1°) — that is the first-quadrant mirror of w. Figure: the long counter-clockwise sweep of 4.07 rad. About 4 min.</w:t>
       </w:r>
     </w:p>
     <w:p>
@@ -946,61 +1410,115 @@
           <w:sz w:val="22"/>
           <w:szCs w:val="22"/>
         </w:rPr>
-        <w:t xml:space="preserve">z_a has |z_a| = 3, ∠ = π/2; z_b = 4 + 0j. About 4 min. Step 1: Re{z_a} = 3 cos(π/2) = 0, Im = 3 sin(π/2) = 3, so z_a = 3j.</w:t>
-      </w:r>
-    </w:p>
-    <w:p>
-      <w:pPr>
-        <w:pStyle w:val="ListParagraph"/>
-        <w:numPr>
-          <w:ilvl w:val="0"/>
-          <w:numId w:val="2"/>
-        </w:numPr>
-        <w:spacing w:after="80"/>
-      </w:pPr>
-      <w:r>
-        <w:rPr>
-          <w:rFonts w:ascii="Calibri" w:cs="Calibri" w:eastAsia="Calibri" w:hAnsi="Calibri"/>
-          <w:sz w:val="22"/>
-          <w:szCs w:val="22"/>
-        </w:rPr>
-        <w:t xml:space="preserve">Step 2: add in Cartesian: (0 + 4) + (3 + 0)j = 4 + 3j.</w:t>
-      </w:r>
-    </w:p>
-    <w:p>
-      <w:pPr>
-        <w:pStyle w:val="ListParagraph"/>
-        <w:numPr>
-          <w:ilvl w:val="0"/>
-          <w:numId w:val="2"/>
-        </w:numPr>
-        <w:spacing w:after="80"/>
-      </w:pPr>
-      <w:r>
-        <w:rPr>
-          <w:rFonts w:ascii="Calibri" w:cs="Calibri" w:eastAsia="Calibri" w:hAnsi="Calibri"/>
-          <w:sz w:val="22"/>
-          <w:szCs w:val="22"/>
-        </w:rPr>
-        <w:t xml:space="preserve">Step 3: r = √(16 + 9) = 5, θ = arctan(3/4) = 0.6435 rad = 36.9° (x &gt; 0, no π).</w:t>
-      </w:r>
-    </w:p>
-    <w:p>
-      <w:pPr>
-        <w:pStyle w:val="ListParagraph"/>
-        <w:numPr>
-          <w:ilvl w:val="0"/>
-          <w:numId w:val="2"/>
-        </w:numPr>
-        <w:spacing w:after="80"/>
-      </w:pPr>
-      <w:r>
-        <w:rPr>
-          <w:rFonts w:ascii="Calibri" w:cs="Calibri" w:eastAsia="Calibri" w:hAnsi="Calibri"/>
-          <w:sz w:val="22"/>
-          <w:szCs w:val="22"/>
-        </w:rPr>
-        <w:t xml:space="preserve">Takeaway: |z_a + z_b| = 5 ≠ 3 + 4 = 7: moduli do not add. Never add polar forms directly.</w:t>
+        <w:t xml:space="preserve">Given: z_a has |z_a| = 3, ∠z_a = π/2 (polar); z_b = 4 + 0j (Cartesian). Task: z_a + z_b and its polar form. Rule: add in Cartesian, never in polar.</w:t>
+      </w:r>
+    </w:p>
+    <w:p>
+      <w:pPr>
+        <w:pStyle w:val="ListParagraph"/>
+        <w:numPr>
+          <w:ilvl w:val="0"/>
+          <w:numId w:val="2"/>
+        </w:numPr>
+        <w:spacing w:after="80"/>
+      </w:pPr>
+      <w:r>
+        <w:rPr>
+          <w:rFonts w:ascii="Calibri" w:cs="Calibri" w:eastAsia="Calibri" w:hAnsi="Calibri"/>
+          <w:sz w:val="22"/>
+          <w:szCs w:val="22"/>
+        </w:rPr>
+        <w:t xml:space="preserve">Step 1 — z_a to Cartesian: Re{z_a} = 3 cos(π/2) = 3(0) = 0. Im{z_a} = 3 sin(π/2) = 3(1) = 3. So z_a = 0 + 3j: straight up, length 3.</w:t>
+      </w:r>
+    </w:p>
+    <w:p>
+      <w:pPr>
+        <w:pStyle w:val="ListParagraph"/>
+        <w:numPr>
+          <w:ilvl w:val="0"/>
+          <w:numId w:val="2"/>
+        </w:numPr>
+        <w:spacing w:after="80"/>
+      </w:pPr>
+      <w:r>
+        <w:rPr>
+          <w:rFonts w:ascii="Calibri" w:cs="Calibri" w:eastAsia="Calibri" w:hAnsi="Calibri"/>
+          <w:sz w:val="22"/>
+          <w:szCs w:val="22"/>
+        </w:rPr>
+        <w:t xml:space="preserve">Step 2 — add the real parts: 0 + 4 = 4. Add the imaginary parts: 3 + 0 = 3. So z_a + z_b = 4 + 3j.</w:t>
+      </w:r>
+    </w:p>
+    <w:p>
+      <w:pPr>
+        <w:pStyle w:val="ListParagraph"/>
+        <w:numPr>
+          <w:ilvl w:val="0"/>
+          <w:numId w:val="2"/>
+        </w:numPr>
+        <w:spacing w:after="80"/>
+      </w:pPr>
+      <w:r>
+        <w:rPr>
+          <w:rFonts w:ascii="Calibri" w:cs="Calibri" w:eastAsia="Calibri" w:hAnsi="Calibri"/>
+          <w:sz w:val="22"/>
+          <w:szCs w:val="22"/>
+        </w:rPr>
+        <w:t xml:space="preserve">Step 3 — modulus: 4² = 16, 3² = 9, 16 + 9 = 25, r = 5.</w:t>
+      </w:r>
+    </w:p>
+    <w:p>
+      <w:pPr>
+        <w:pStyle w:val="ListParagraph"/>
+        <w:numPr>
+          <w:ilvl w:val="0"/>
+          <w:numId w:val="2"/>
+        </w:numPr>
+        <w:spacing w:after="80"/>
+      </w:pPr>
+      <w:r>
+        <w:rPr>
+          <w:rFonts w:ascii="Calibri" w:cs="Calibri" w:eastAsia="Calibri" w:hAnsi="Calibri"/>
+          <w:sz w:val="22"/>
+          <w:szCs w:val="22"/>
+        </w:rPr>
+        <w:t xml:space="preserve">Step 4 — angle: y/x = 3/4 = 0.75, arctan(0.75) = 0.6435 rad = 36.87°. x = 4 &gt; 0, so no π.</w:t>
+      </w:r>
+    </w:p>
+    <w:p>
+      <w:pPr>
+        <w:pStyle w:val="ListParagraph"/>
+        <w:numPr>
+          <w:ilvl w:val="0"/>
+          <w:numId w:val="2"/>
+        </w:numPr>
+        <w:spacing w:after="80"/>
+      </w:pPr>
+      <w:r>
+        <w:rPr>
+          <w:rFonts w:ascii="Calibri" w:cs="Calibri" w:eastAsia="Calibri" w:hAnsi="Calibri"/>
+          <w:sz w:val="22"/>
+          <w:szCs w:val="22"/>
+        </w:rPr>
+        <w:t xml:space="preserve">Check on the figure: the parallelogram with sides 3j and 4 has its diagonal 5 long (a 3–4–5 triangle).</w:t>
+      </w:r>
+    </w:p>
+    <w:p>
+      <w:pPr>
+        <w:pStyle w:val="ListParagraph"/>
+        <w:numPr>
+          <w:ilvl w:val="0"/>
+          <w:numId w:val="2"/>
+        </w:numPr>
+        <w:spacing w:after="80"/>
+      </w:pPr>
+      <w:r>
+        <w:rPr>
+          <w:rFonts w:ascii="Calibri" w:cs="Calibri" w:eastAsia="Calibri" w:hAnsi="Calibri"/>
+          <w:sz w:val="22"/>
+          <w:szCs w:val="22"/>
+        </w:rPr>
+        <w:t xml:space="preserve">Takeaway: |z_a + z_b| = 5 but |z_a| + |z_b| = 3 + 4 = 7. Moduli do not add. About 4 min.</w:t>
       </w:r>
     </w:p>
     <w:p>
@@ -1048,25 +1566,43 @@
           <w:sz w:val="22"/>
           <w:szCs w:val="22"/>
         </w:rPr>
-        <w:t xml:space="preserve">Timing: about 5 min. z₃ = 5 − 2j (Cartesian), z₄: |z₄| = 4, ∠ = −π/6 (polar). Let students try with minimal algebra.</w:t>
-      </w:r>
-    </w:p>
-    <w:p>
-      <w:pPr>
-        <w:pStyle w:val="ListParagraph"/>
-        <w:numPr>
-          <w:ilvl w:val="0"/>
-          <w:numId w:val="2"/>
-        </w:numPr>
-        <w:spacing w:after="80"/>
-      </w:pPr>
-      <w:r>
-        <w:rPr>
-          <w:rFonts w:ascii="Calibri" w:cs="Calibri" w:eastAsia="Calibri" w:hAnsi="Calibri"/>
-          <w:sz w:val="22"/>
-          <w:szCs w:val="22"/>
-        </w:rPr>
-        <w:t xml:space="preserve">Hints on the slide: z₃ = −z₁ (reflection of z₁ through the origin), z₄ and z₂ are reflections across the real axis.</w:t>
+        <w:t xml:space="preserve">Given: z₃ = 5 − 2j (Cartesian) and z₄ with |z₄| = 4, ∠z₄ = −π/6 (polar). Task: plot both, with as little algebra as possible. About 5 min.</w:t>
+      </w:r>
+    </w:p>
+    <w:p>
+      <w:pPr>
+        <w:pStyle w:val="ListParagraph"/>
+        <w:numPr>
+          <w:ilvl w:val="0"/>
+          <w:numId w:val="2"/>
+        </w:numPr>
+        <w:spacing w:after="80"/>
+      </w:pPr>
+      <w:r>
+        <w:rPr>
+          <w:rFonts w:ascii="Calibri" w:cs="Calibri" w:eastAsia="Calibri" w:hAnsi="Calibri"/>
+          <w:sz w:val="22"/>
+          <w:szCs w:val="22"/>
+        </w:rPr>
+        <w:t xml:space="preserve">Let students try first. Hint 1: z₃ = −z₁ (z₁ = −5 + 2j; negate both parts), so z₃ is z₁ reflected through the origin. Hint 2: z₄ and z₂ have the same modulus and opposite angles (mirror images across the real axis).</w:t>
+      </w:r>
+    </w:p>
+    <w:p>
+      <w:pPr>
+        <w:pStyle w:val="ListParagraph"/>
+        <w:numPr>
+          <w:ilvl w:val="0"/>
+          <w:numId w:val="2"/>
+        </w:numPr>
+        <w:spacing w:after="80"/>
+      </w:pPr>
+      <w:r>
+        <w:rPr>
+          <w:rFonts w:ascii="Calibri" w:cs="Calibri" w:eastAsia="Calibri" w:hAnsi="Calibri"/>
+          <w:sz w:val="22"/>
+          <w:szCs w:val="22"/>
+        </w:rPr>
+        <w:t xml:space="preserve">If a student is stuck: z₃ is 5 to the right and 2 down; z₄ is the mirror of z₂ = 3.464 + 2j, i.e. 3.464 − 2j.</w:t>
       </w:r>
     </w:p>
     <w:p>
@@ -1114,99 +1650,133 @@
           <w:sz w:val="22"/>
           <w:szCs w:val="22"/>
         </w:rPr>
-        <w:t xml:space="preserve">z₃: |z₃| = √(25 + 4) = √29 ≈ 5.385; θ₃ = arctan(−2/5) = arctan(−0.4) = −0.3805 rad = −21.8°; x = 5 &gt; 0 so no π.</w:t>
-      </w:r>
-    </w:p>
-    <w:p>
-      <w:pPr>
-        <w:pStyle w:val="ListParagraph"/>
-        <w:numPr>
-          <w:ilvl w:val="0"/>
-          <w:numId w:val="2"/>
-        </w:numPr>
-        <w:spacing w:after="80"/>
-      </w:pPr>
-      <w:r>
-        <w:rPr>
-          <w:rFonts w:ascii="Calibri" w:cs="Calibri" w:eastAsia="Calibri" w:hAnsi="Calibri"/>
-          <w:sz w:val="22"/>
-          <w:szCs w:val="22"/>
-        </w:rPr>
-        <w:t xml:space="preserve">z₄: Re = 4 cos(−π/6) = 4·√3/2 = 2√3 ≈ 3.464, Im = 4 sin(−π/6) = −2 (cos even, sin odd).</w:t>
-      </w:r>
-    </w:p>
-    <w:p>
-      <w:pPr>
-        <w:pStyle w:val="ListParagraph"/>
-        <w:numPr>
-          <w:ilvl w:val="0"/>
-          <w:numId w:val="2"/>
-        </w:numPr>
-        <w:spacing w:after="80"/>
-      </w:pPr>
-      <w:r>
-        <w:rPr>
-          <w:rFonts w:ascii="Calibri" w:cs="Calibri" w:eastAsia="Calibri" w:hAnsi="Calibri"/>
-          <w:sz w:val="22"/>
-          <w:szCs w:val="22"/>
-        </w:rPr>
-        <w:t xml:space="preserve">Symmetry check: z₃ = −z₁, same modulus √29 with angle θ₁ − π = 2.7611 − 3.1416 = −0.3805 ✓. z₄ is the conjugate of z₂ (same real part, imaginary part negated): same modulus 4, angle −π/6 ✓.</w:t>
-      </w:r>
-    </w:p>
-    <w:p>
-      <w:pPr>
-        <w:pBdr>
-          <w:left w:val="single" w:color="7A1A1A" w:sz="18" w:space="8"/>
-        </w:pBdr>
-        <w:spacing w:after="140" w:before="100"/>
-        <w:ind w:left="360"/>
-      </w:pPr>
-      <w:r>
-        <w:rPr>
-          <w:rFonts w:ascii="Calibri" w:cs="Calibri" w:eastAsia="Calibri" w:hAnsi="Calibri"/>
-          <w:b/>
-          <w:bCs/>
-          <w:color w:val="7A1A1A"/>
-          <w:sz w:val="22"/>
-          <w:szCs w:val="22"/>
-        </w:rPr>
-        <w:t xml:space="preserve">Figure (notebook cell 10): </w:t>
-      </w:r>
-      <w:r>
-        <w:rPr>
-          <w:rFonts w:ascii="Calibri" w:cs="Calibri" w:eastAsia="Calibri" w:hAnsi="Calibri"/>
-          <w:sz w:val="22"/>
-          <w:szCs w:val="22"/>
-        </w:rPr>
-        <w:t xml:space="preserve">All four points. The dashed line joins the conjugate pair z₂, z₄; z₃ is z₁ rotated 180° about the origin (they lie on one line through 0).</w:t>
-      </w:r>
-    </w:p>
-    <w:p>
-      <w:pPr>
-        <w:pBdr>
-          <w:left w:val="single" w:color="7A1A1A" w:sz="18" w:space="8"/>
-        </w:pBdr>
-        <w:spacing w:after="140" w:before="100"/>
-        <w:ind w:left="360"/>
-      </w:pPr>
-      <w:r>
-        <w:rPr>
-          <w:rFonts w:ascii="Calibri" w:cs="Calibri" w:eastAsia="Calibri" w:hAnsi="Calibri"/>
-          <w:b/>
-          <w:bCs/>
-          <w:color w:val="7A1A1A"/>
-          <w:sz w:val="22"/>
-          <w:szCs w:val="22"/>
-        </w:rPr>
-        <w:t xml:space="preserve">Common error: </w:t>
-      </w:r>
-      <w:r>
-        <w:rPr>
-          <w:rFonts w:ascii="Calibri" w:cs="Calibri" w:eastAsia="Calibri" w:hAnsi="Calibri"/>
-          <w:sz w:val="22"/>
-          <w:szCs w:val="22"/>
-        </w:rPr>
-        <w:t xml:space="preserve">Calling z₃ the conjugate of z₁. The conjugate of z₁ is −5 − 2j; z₃ = −z₁ = 5 − 2j.</w:t>
+        <w:t xml:space="preserve">Third number, Cartesian → polar. Step 1 — |z₃| = √(5² + (−2)²) = √(25 + 4) = √29 = 5.385.</w:t>
+      </w:r>
+    </w:p>
+    <w:p>
+      <w:pPr>
+        <w:pStyle w:val="ListParagraph"/>
+        <w:numPr>
+          <w:ilvl w:val="0"/>
+          <w:numId w:val="2"/>
+        </w:numPr>
+        <w:spacing w:after="80"/>
+      </w:pPr>
+      <w:r>
+        <w:rPr>
+          <w:rFonts w:ascii="Calibri" w:cs="Calibri" w:eastAsia="Calibri" w:hAnsi="Calibri"/>
+          <w:sz w:val="22"/>
+          <w:szCs w:val="22"/>
+        </w:rPr>
+        <w:t xml:space="preserve">Step 2 — y/x = −2/5 = −0.4, arctan(−0.4) = −0.3805 rad = −21.8°. Step 3 — x = 5 &gt; 0, fourth quadrant, no π added: θ₃ = −0.3805 rad.</w:t>
+      </w:r>
+    </w:p>
+    <w:p>
+      <w:pPr>
+        <w:pStyle w:val="ListParagraph"/>
+        <w:numPr>
+          <w:ilvl w:val="0"/>
+          <w:numId w:val="2"/>
+        </w:numPr>
+        <w:spacing w:after="80"/>
+      </w:pPr>
+      <w:r>
+        <w:rPr>
+          <w:rFonts w:ascii="Calibri" w:cs="Calibri" w:eastAsia="Calibri" w:hAnsi="Calibri"/>
+          <w:sz w:val="22"/>
+          <w:szCs w:val="22"/>
+        </w:rPr>
+        <w:t xml:space="preserve">Fourth number, polar → Cartesian. Step 4 — x = 4 cos(−π/6). cos is even, so cos(−π/6) = cos(π/6) = √3/2, giving x = 4(0.8660) = 3.464 = 2√3.</w:t>
+      </w:r>
+    </w:p>
+    <w:p>
+      <w:pPr>
+        <w:pStyle w:val="ListParagraph"/>
+        <w:numPr>
+          <w:ilvl w:val="0"/>
+          <w:numId w:val="2"/>
+        </w:numPr>
+        <w:spacing w:after="80"/>
+      </w:pPr>
+      <w:r>
+        <w:rPr>
+          <w:rFonts w:ascii="Calibri" w:cs="Calibri" w:eastAsia="Calibri" w:hAnsi="Calibri"/>
+          <w:sz w:val="22"/>
+          <w:szCs w:val="22"/>
+        </w:rPr>
+        <w:t xml:space="preserve">Step 5 — y = 4 sin(−π/6). sin is odd, so sin(−π/6) = −sin(π/6) = −1/2, giving y = 4(−0.5) = −2. So z₄ = 3.464 − 2j.</w:t>
+      </w:r>
+    </w:p>
+    <w:p>
+      <w:pPr>
+        <w:pStyle w:val="ListParagraph"/>
+        <w:numPr>
+          <w:ilvl w:val="0"/>
+          <w:numId w:val="2"/>
+        </w:numPr>
+        <w:spacing w:after="80"/>
+      </w:pPr>
+      <w:r>
+        <w:rPr>
+          <w:rFonts w:ascii="Calibri" w:cs="Calibri" w:eastAsia="Calibri" w:hAnsi="Calibri"/>
+          <w:sz w:val="22"/>
+          <w:szCs w:val="22"/>
+        </w:rPr>
+        <w:t xml:space="preserve">Symmetry check 1 — z₃ = −z₁: same modulus √29. Angle of −z₁ is θ₁ − π = 2.7611 − 3.1416 = −0.3805 ✓ (matches Step 3).</w:t>
+      </w:r>
+    </w:p>
+    <w:p>
+      <w:pPr>
+        <w:pStyle w:val="ListParagraph"/>
+        <w:numPr>
+          <w:ilvl w:val="0"/>
+          <w:numId w:val="2"/>
+        </w:numPr>
+        <w:spacing w:after="80"/>
+      </w:pPr>
+      <w:r>
+        <w:rPr>
+          <w:rFonts w:ascii="Calibri" w:cs="Calibri" w:eastAsia="Calibri" w:hAnsi="Calibri"/>
+          <w:sz w:val="22"/>
+          <w:szCs w:val="22"/>
+        </w:rPr>
+        <w:t xml:space="preserve">Symmetry check 2 — z₄ is the conjugate of z₂ (z₂ = 3.464 + 2j; the conjugate keeps the real part and negates the imaginary part, written z* = x − jy). Same modulus 4, angle +π/6 → −π/6 ✓.</w:t>
+      </w:r>
+    </w:p>
+    <w:p>
+      <w:pPr>
+        <w:pStyle w:val="ListParagraph"/>
+        <w:numPr>
+          <w:ilvl w:val="0"/>
+          <w:numId w:val="2"/>
+        </w:numPr>
+        <w:spacing w:after="80"/>
+      </w:pPr>
+      <w:r>
+        <w:rPr>
+          <w:rFonts w:ascii="Calibri" w:cs="Calibri" w:eastAsia="Calibri" w:hAnsi="Calibri"/>
+          <w:sz w:val="22"/>
+          <w:szCs w:val="22"/>
+        </w:rPr>
+        <w:t xml:space="preserve">Figure: all four points. The dashed line joins the conjugate pair z₂, z₄ (mirror across the real axis). z₃ is z₁ turned 180° about the origin: they lie on one line through 0.</w:t>
+      </w:r>
+    </w:p>
+    <w:p>
+      <w:pPr>
+        <w:pStyle w:val="ListParagraph"/>
+        <w:numPr>
+          <w:ilvl w:val="0"/>
+          <w:numId w:val="2"/>
+        </w:numPr>
+        <w:spacing w:after="80"/>
+      </w:pPr>
+      <w:r>
+        <w:rPr>
+          <w:rFonts w:ascii="Calibri" w:cs="Calibri" w:eastAsia="Calibri" w:hAnsi="Calibri"/>
+          <w:sz w:val="22"/>
+          <w:szCs w:val="22"/>
+        </w:rPr>
+        <w:t xml:space="preserve">Pitfall: calling z₃ the conjugate of z₁. The conjugate of z₁ is −5 − 2j; z₃ = −z₁ = 5 − 2j.</w:t>
       </w:r>
     </w:p>
     <w:p>
@@ -1254,25 +1824,61 @@
           <w:sz w:val="22"/>
           <w:szCs w:val="22"/>
         </w:rPr>
-        <w:t xml:space="preserve">Scaling cz (real c) and the sum z₁ + z₂ mean exactly what they do for 2-D vectors. Rule: z₁ + z₂ = (x₁ + x₂) + j(y₁ + y₂) and cz = cx + jcy, with z_k = x_k + jy_k.</w:t>
-      </w:r>
-    </w:p>
-    <w:p>
-      <w:pPr>
-        <w:pStyle w:val="ListParagraph"/>
-        <w:numPr>
-          <w:ilvl w:val="0"/>
-          <w:numId w:val="2"/>
-        </w:numPr>
-        <w:spacing w:after="80"/>
-      </w:pPr>
-      <w:r>
-        <w:rPr>
-          <w:rFonts w:ascii="Calibri" w:cs="Calibri" w:eastAsia="Calibri" w:hAnsi="Calibri"/>
-          <w:sz w:val="22"/>
-          <w:szCs w:val="22"/>
-        </w:rPr>
-        <w:t xml:space="preserve">In polar form, moduli and angles do not simply add. The parallelogram figure shows z₁, z₂ and the diagonal.</w:t>
+        <w:t xml:space="preserve">Notation: z_k = x_k + jy_k means the k-th number has real part x_k and imaginary part y_k. c is a REAL scalar (an ordinary number).</w:t>
+      </w:r>
+    </w:p>
+    <w:p>
+      <w:pPr>
+        <w:pStyle w:val="ListParagraph"/>
+        <w:numPr>
+          <w:ilvl w:val="0"/>
+          <w:numId w:val="2"/>
+        </w:numPr>
+        <w:spacing w:after="80"/>
+      </w:pPr>
+      <w:r>
+        <w:rPr>
+          <w:rFonts w:ascii="Calibri" w:cs="Calibri" w:eastAsia="Calibri" w:hAnsi="Calibri"/>
+          <w:sz w:val="22"/>
+          <w:szCs w:val="22"/>
+        </w:rPr>
+        <w:t xml:space="preserve">Sum rule: z₁ + z₂ = (x₁ + x₂) + j(y₁ + y₂). Scaling rule: c z = c x + j c y (multiply both parts).</w:t>
+      </w:r>
+    </w:p>
+    <w:p>
+      <w:pPr>
+        <w:pStyle w:val="ListParagraph"/>
+        <w:numPr>
+          <w:ilvl w:val="0"/>
+          <w:numId w:val="2"/>
+        </w:numPr>
+        <w:spacing w:after="80"/>
+      </w:pPr>
+      <w:r>
+        <w:rPr>
+          <w:rFonts w:ascii="Calibri" w:cs="Calibri" w:eastAsia="Calibri" w:hAnsi="Calibri"/>
+          <w:sz w:val="22"/>
+          <w:szCs w:val="22"/>
+        </w:rPr>
+        <w:t xml:space="preserve">Tiny example: z₁ = −5 + 2j, c = 2: 2z₁ = 2(−5) + j2(2) = −10 + 4j. Same direction, twice as long (|2z₁| = 10.770 = 2 × 5.385).</w:t>
+      </w:r>
+    </w:p>
+    <w:p>
+      <w:pPr>
+        <w:pStyle w:val="ListParagraph"/>
+        <w:numPr>
+          <w:ilvl w:val="0"/>
+          <w:numId w:val="2"/>
+        </w:numPr>
+        <w:spacing w:after="80"/>
+      </w:pPr>
+      <w:r>
+        <w:rPr>
+          <w:rFonts w:ascii="Calibri" w:cs="Calibri" w:eastAsia="Calibri" w:hAnsi="Calibri"/>
+          <w:sz w:val="22"/>
+          <w:szCs w:val="22"/>
+        </w:rPr>
+        <w:t xml:space="preserve">Draw the parallelogram: from 0 draw z₁ and z₂; the far corner is z₁ + z₂. In polar form moduli and angles do NOT simply add.</w:t>
       </w:r>
     </w:p>
     <w:p>
@@ -1320,25 +1926,97 @@
           <w:sz w:val="22"/>
           <w:szCs w:val="22"/>
         </w:rPr>
-        <w:t xml:space="preserve">Notebook cell 13, using z₁ = −5 + 2j and z₂ = 2√3 + 2j.</w:t>
-      </w:r>
-    </w:p>
-    <w:p>
-      <w:pPr>
-        <w:pStyle w:val="ListParagraph"/>
-        <w:numPr>
-          <w:ilvl w:val="0"/>
-          <w:numId w:val="2"/>
-        </w:numPr>
-        <w:spacing w:after="80"/>
-      </w:pPr>
-      <w:r>
-        <w:rPr>
-          <w:rFonts w:ascii="Calibri" w:cs="Calibri" w:eastAsia="Calibri" w:hAnsi="Calibri"/>
-          <w:sz w:val="22"/>
-          <w:szCs w:val="22"/>
-        </w:rPr>
-        <w:t xml:space="preserve">Left panel: 2z₁ = −10 + 4j, same direction, twice as long. Right panel: z₁ + z₂ = (−5 + 3.464) + j(2 + 2) = −1.536 + 4j, the far corner of the dashed parallelogram; |z₁ + z₂| = √(1.536² + 4²) = 4.285 while |z₁| + |z₂| = 5.385 + 4 = 9.385.</w:t>
+        <w:t xml:space="preserve">Data: z₁ = −5 + 2j, z₂ = 2√3 + 2j = 3.464 + 2j. Left panel: scaling. Right panel: sum.</w:t>
+      </w:r>
+    </w:p>
+    <w:p>
+      <w:pPr>
+        <w:pStyle w:val="ListParagraph"/>
+        <w:numPr>
+          <w:ilvl w:val="0"/>
+          <w:numId w:val="2"/>
+        </w:numPr>
+        <w:spacing w:after="80"/>
+      </w:pPr>
+      <w:r>
+        <w:rPr>
+          <w:rFonts w:ascii="Calibri" w:cs="Calibri" w:eastAsia="Calibri" w:hAnsi="Calibri"/>
+          <w:sz w:val="22"/>
+          <w:szCs w:val="22"/>
+        </w:rPr>
+        <w:t xml:space="preserve">Scaling, Step 1 — 2z₁ = 2(−5) + j(2·2) = −10 + 4j. Step 2 — |2z₁| = √(100 + 16) = √116 = 10.770 = 2 × 5.385 ✓.</w:t>
+      </w:r>
+    </w:p>
+    <w:p>
+      <w:pPr>
+        <w:pStyle w:val="ListParagraph"/>
+        <w:numPr>
+          <w:ilvl w:val="0"/>
+          <w:numId w:val="2"/>
+        </w:numPr>
+        <w:spacing w:after="80"/>
+      </w:pPr>
+      <w:r>
+        <w:rPr>
+          <w:rFonts w:ascii="Calibri" w:cs="Calibri" w:eastAsia="Calibri" w:hAnsi="Calibri"/>
+          <w:sz w:val="22"/>
+          <w:szCs w:val="22"/>
+        </w:rPr>
+        <w:t xml:space="preserve">Sum, Step 3 — real parts: −5 + 3.464 = −1.536. Step 4 — imaginary parts: 2 + 2 = 4. So z₁ + z₂ = −1.536 + 4j.</w:t>
+      </w:r>
+    </w:p>
+    <w:p>
+      <w:pPr>
+        <w:pStyle w:val="ListParagraph"/>
+        <w:numPr>
+          <w:ilvl w:val="0"/>
+          <w:numId w:val="2"/>
+        </w:numPr>
+        <w:spacing w:after="80"/>
+      </w:pPr>
+      <w:r>
+        <w:rPr>
+          <w:rFonts w:ascii="Calibri" w:cs="Calibri" w:eastAsia="Calibri" w:hAnsi="Calibri"/>
+          <w:sz w:val="22"/>
+          <w:szCs w:val="22"/>
+        </w:rPr>
+        <w:t xml:space="preserve">Step 5 — modulus: (−1.536)² = 2.359, 4² = 16, sum 18.359, √18.359 = 4.285. Compare |z₁| + |z₂| = 5.385 + 4 = 9.385: far larger, so moduli do not add.</w:t>
+      </w:r>
+    </w:p>
+    <w:p>
+      <w:pPr>
+        <w:pStyle w:val="ListParagraph"/>
+        <w:numPr>
+          <w:ilvl w:val="0"/>
+          <w:numId w:val="2"/>
+        </w:numPr>
+        <w:spacing w:after="80"/>
+      </w:pPr>
+      <w:r>
+        <w:rPr>
+          <w:rFonts w:ascii="Calibri" w:cs="Calibri" w:eastAsia="Calibri" w:hAnsi="Calibri"/>
+          <w:sz w:val="22"/>
+          <w:szCs w:val="22"/>
+        </w:rPr>
+        <w:t xml:space="preserve">Step 6 — angle: x &lt; 0, so arctan(4/(−1.536)) = arctan(−2.604) = −1.204, add π: 1.937 rad = 111.0° (second quadrant, matches the picture).</w:t>
+      </w:r>
+    </w:p>
+    <w:p>
+      <w:pPr>
+        <w:pStyle w:val="ListParagraph"/>
+        <w:numPr>
+          <w:ilvl w:val="0"/>
+          <w:numId w:val="2"/>
+        </w:numPr>
+        <w:spacing w:after="80"/>
+      </w:pPr>
+      <w:r>
+        <w:rPr>
+          <w:rFonts w:ascii="Calibri" w:cs="Calibri" w:eastAsia="Calibri" w:hAnsi="Calibri"/>
+          <w:sz w:val="22"/>
+          <w:szCs w:val="22"/>
+        </w:rPr>
+        <w:t xml:space="preserve">Point at: the far corner of the dashed parallelogram is the sum; z₂ shifted to the tip of z₁ lands there too.</w:t>
       </w:r>
     </w:p>
     <w:p>
@@ -1386,53 +2064,79 @@
           <w:sz w:val="22"/>
           <w:szCs w:val="22"/>
         </w:rPr>
-        <w:t xml:space="preserve">About 2 min, using notebook cell 15. 1: forgetting π when x &lt; 0 (bare arctan only knows the slope). 2: adding polar forms (|z₁ + z₂| ≠ |z₁| + |z₂|). 3: degrees vs radians. 4: range conventions.</w:t>
-      </w:r>
-    </w:p>
-    <w:p>
-      <w:pPr>
-        <w:pBdr>
-          <w:left w:val="single" w:color="7A1A1A" w:sz="18" w:space="8"/>
-        </w:pBdr>
-        <w:spacing w:after="140" w:before="100"/>
-        <w:ind w:left="360"/>
-      </w:pPr>
-      <w:r>
-        <w:rPr>
-          <w:rFonts w:ascii="Calibri" w:cs="Calibri" w:eastAsia="Calibri" w:hAnsi="Calibri"/>
-          <w:b/>
-          <w:bCs/>
-          <w:color w:val="7A1A1A"/>
-          <w:sz w:val="22"/>
-          <w:szCs w:val="22"/>
-        </w:rPr>
-        <w:t xml:space="preserve">Figure (generated from the notebook arctan/arctan2 demo): </w:t>
-      </w:r>
-      <w:r>
-        <w:rPr>
-          <w:rFonts w:ascii="Calibri" w:cs="Calibri" w:eastAsia="Calibri" w:hAnsi="Calibri"/>
-          <w:sz w:val="22"/>
-          <w:szCs w:val="22"/>
-        </w:rPr>
-        <w:t xml:space="preserve">Top: z = −5 + 2j; the dashed gray ray is the bare arctan, −0.3805 rad (−21.8°), the red arrow is the true direction, 2.7611 rad (158.2°). Bottom: w = −3 − 4j; bare arctan +0.9273 (53.1°), true angle 4.0689 rad (233.1°). Both are off by exactly π.</w:t>
-      </w:r>
-    </w:p>
-    <w:p>
-      <w:pPr>
-        <w:pStyle w:val="ListParagraph"/>
-        <w:numPr>
-          <w:ilvl w:val="0"/>
-          <w:numId w:val="2"/>
-        </w:numPr>
-        <w:spacing w:after="80"/>
-      </w:pPr>
-      <w:r>
-        <w:rPr>
-          <w:rFonts w:ascii="Calibri" w:cs="Calibri" w:eastAsia="Calibri" w:hAnsi="Calibri"/>
-          <w:sz w:val="22"/>
-          <w:szCs w:val="22"/>
-        </w:rPr>
-        <w:t xml:space="preserve">Range note: atan2 returns angles in (−π, π], so for w it gives −2.2143 rad; this is the same direction as 4.0689 because 4.0689 − 2π = −2.2143. Either is correct; stay consistent.</w:t>
+        <w:t xml:space="preserve">Pitfall 1 — forgetting π when x &lt; 0. Take z = −5 + 2j: arctan(2/(−5)) = −0.3805 rad = −21.8° (dashed gray ray in the figure, pointing down-right) but the true direction is 2.7611 rad = 158.2° (red arrow, up-left). Difference: 2.7611 − (−0.3805) = 3.1416 = π ✓.</w:t>
+      </w:r>
+    </w:p>
+    <w:p>
+      <w:pPr>
+        <w:pStyle w:val="ListParagraph"/>
+        <w:numPr>
+          <w:ilvl w:val="0"/>
+          <w:numId w:val="2"/>
+        </w:numPr>
+        <w:spacing w:after="80"/>
+      </w:pPr>
+      <w:r>
+        <w:rPr>
+          <w:rFonts w:ascii="Calibri" w:cs="Calibri" w:eastAsia="Calibri" w:hAnsi="Calibri"/>
+          <w:sz w:val="22"/>
+          <w:szCs w:val="22"/>
+        </w:rPr>
+        <w:t xml:space="preserve">Same story for w = −3 − 4j: bare arctan(4/3) = +0.9273 rad = 53.1° versus the true 4.0689 rad = 233.1°. Difference 4.0689 − 0.9273 = 3.1416 = π ✓.</w:t>
+      </w:r>
+    </w:p>
+    <w:p>
+      <w:pPr>
+        <w:pStyle w:val="ListParagraph"/>
+        <w:numPr>
+          <w:ilvl w:val="0"/>
+          <w:numId w:val="2"/>
+        </w:numPr>
+        <w:spacing w:after="80"/>
+      </w:pPr>
+      <w:r>
+        <w:rPr>
+          <w:rFonts w:ascii="Calibri" w:cs="Calibri" w:eastAsia="Calibri" w:hAnsi="Calibri"/>
+          <w:sz w:val="22"/>
+          <w:szCs w:val="22"/>
+        </w:rPr>
+        <w:t xml:space="preserve">Pitfall 2 — adding polar forms. Example B: |z_a| + |z_b| = 3 + 4 = 7 but |z_a + z_b| = 5. Add in Cartesian.</w:t>
+      </w:r>
+    </w:p>
+    <w:p>
+      <w:pPr>
+        <w:pStyle w:val="ListParagraph"/>
+        <w:numPr>
+          <w:ilvl w:val="0"/>
+          <w:numId w:val="2"/>
+        </w:numPr>
+        <w:spacing w:after="80"/>
+      </w:pPr>
+      <w:r>
+        <w:rPr>
+          <w:rFonts w:ascii="Calibri" w:cs="Calibri" w:eastAsia="Calibri" w:hAnsi="Calibri"/>
+          <w:sz w:val="22"/>
+          <w:szCs w:val="22"/>
+        </w:rPr>
+        <w:t xml:space="preserve">Pitfall 3 — calculator in degrees when you want radians (or vice versa). Test: arctan(1) should print 0.785 (radians) not 45 (degrees).</w:t>
+      </w:r>
+    </w:p>
+    <w:p>
+      <w:pPr>
+        <w:pStyle w:val="ListParagraph"/>
+        <w:numPr>
+          <w:ilvl w:val="0"/>
+          <w:numId w:val="2"/>
+        </w:numPr>
+        <w:spacing w:after="80"/>
+      </w:pPr>
+      <w:r>
+        <w:rPr>
+          <w:rFonts w:ascii="Calibri" w:cs="Calibri" w:eastAsia="Calibri" w:hAnsi="Calibri"/>
+          <w:sz w:val="22"/>
+          <w:szCs w:val="22"/>
+        </w:rPr>
+        <w:t xml:space="preserve">Pitfall 4 — range conventions: w = −3 − 4j is 4.0689 rad in [0, 2π) and 4.0689 − 6.2832 = −2.2143 rad in (−π, π]. Same direction.</w:t>
       </w:r>
     </w:p>
     <w:p>

</xml_diff>